<commit_message>
Scrub third-party names and fix cross-doc consistency issues
Removes all remaining third-party name/company references (repo now
speaks only to the ASPCA case study itself), fixes a stale typo, a
stale ADR count in two files, reconciles the 44-vs-48 letter-count
discrepancy between the run walkthrough and the committed evidence,
corrects the hours log's own total against its logged blocks, and
trims two verbatim-duplicated passages into single-source links.
</commit_message>
<xml_diff>
--- a/assessment/ASSESSMENT.docx
+++ b/assessment/ASSESSMENT.docx
@@ -46,7 +46,7 @@
           <w:sz w:val="22"/>
           <w:szCs w:val="22"/>
         </w:rPr>
-        <w:t xml:space="preserve">Prepared in response to the PDS case study: assess the charity-donor-outreach skill, describe improvements and their impact, and rewrite the skill. This document answers both parts directly; the full repository (rewritten skill, tests, run evidence, and a decision record for every change) is the working proof behind it.</w:t>
+        <w:t xml:space="preserve">Prepared in response to the case study brief: assess the charity-donor-outreach skill, describe improvements and their impact, and rewrite the skill. This document answers both parts directly; the full repository (rewritten skill, tests, run evidence, and a decision record for every change) is the working proof behind it.</w:t>
       </w:r>
     </w:p>
     <w:p>
@@ -566,7 +566,7 @@
           <w:sz w:val="21"/>
           <w:szCs w:val="21"/>
         </w:rPr>
-        <w:t xml:space="preserve">27 Architecture Decision Records</w:t>
+        <w:t xml:space="preserve">28 Architecture Decision Records</w:t>
       </w:r>
       <w:r>
         <w:rPr>

</xml_diff>

<commit_message>
Add browser-side upload, cleaning, and persistence to the standalone deliverable
The deliverable could only review the dataset baked in at build time. It now
accepts an upload of the case study's own unedited donor file (or any file
in the same shape), validates it with the same client-side logic already
pinned against the Python pipeline, surfaces the letter-eligibility
conditions the pipeline enforces downstream (mandatory/recommended review,
routed to personal outreach, blocked pending correction), applies suggested
corrections in one action, and persists the cleaned result in the browser
across a reload before it goes back through the pipeline that generates
letters. A new headless test runs the whole flow against the real unedited
fixture and writes a committed metrics report; see ADR 0029.
</commit_message>
<xml_diff>
--- a/assessment/ASSESSMENT.docx
+++ b/assessment/ASSESSMENT.docx
@@ -101,7 +101,7 @@
           <w:sz w:val="22"/>
           <w:szCs w:val="22"/>
         </w:rPr>
-        <w:t xml:space="preserve">Run against the case study's own 50 donors: the pipeline catches four mislabeled tiers (one my own manual review of the table had missed), flags a reference-date trap, routes two lapsed major donors away from form letters, and generates 44 letters with a full audit trail. Nothing is ever sent automatically. 118 automated tests hold this behavior in place, re-run on every change by CI.</w:t>
+        <w:t xml:space="preserve">Run against the case study's own 50 donors: the pipeline catches four mislabeled tiers (one my own manual review of the table had missed), flags a reference-date trap, routes two lapsed major donors away from form letters, and generates 44 letters with a full audit trail. Nothing is ever sent automatically. 122 automated tests hold this behavior in place, re-run on every change by CI.</w:t>
       </w:r>
     </w:p>
     <w:p>
@@ -566,7 +566,7 @@
           <w:sz w:val="21"/>
           <w:szCs w:val="21"/>
         </w:rPr>
-        <w:t xml:space="preserve">28 Architecture Decision Records</w:t>
+        <w:t xml:space="preserve">29 Architecture Decision Records</w:t>
       </w:r>
       <w:r>
         <w:rPr>

</xml_diff>

<commit_message>
Print each letter's real generation date instead of the as_of_date
generate_letters.py built the date printed on every letter from the
campaign config's as_of_date, the same fixed 2024-06-30 reference point
ADR 0004 requires for tier and lapsed-status math. That conflated two
unrelated facts: as_of_date must stay pinned for reproducible business
logic, but the date on a letter a donor actually receives should read the
way any real mail-merge does, as of the day it was written. letter_date now
defaults to today with an optional --letter-date override; as_of_date is
untouched everywhere it drives business rules. Regenerated the committed
output/ evidence and the deliverable so every letter reflects this; only
the date line changed in each, confirmed by diff. See ADR 0031.
</commit_message>
<xml_diff>
--- a/assessment/ASSESSMENT.docx
+++ b/assessment/ASSESSMENT.docx
@@ -101,7 +101,7 @@
           <w:sz w:val="22"/>
           <w:szCs w:val="22"/>
         </w:rPr>
-        <w:t xml:space="preserve">Run against the case study's own 50 donors: the pipeline catches four mislabeled tiers (one my own manual review of the table had missed), flags a reference-date trap, routes two lapsed major donors away from form letters, and generates 44 letters with a full audit trail. Nothing is ever sent automatically. 122 automated tests hold this behavior in place, re-run on every change by CI.</w:t>
+        <w:t xml:space="preserve">Run against the case study's own 50 donors: the pipeline catches four mislabeled tiers (one my own manual review of the table had missed), flags a reference-date trap, routes two lapsed major donors away from form letters, and generates 44 letters with a full audit trail. Nothing is ever sent automatically. 124 automated tests hold this behavior in place, re-run on every change by CI.</w:t>
       </w:r>
     </w:p>
     <w:p>
@@ -566,7 +566,7 @@
           <w:sz w:val="21"/>
           <w:szCs w:val="21"/>
         </w:rPr>
-        <w:t xml:space="preserve">30 Architecture Decision Records</w:t>
+        <w:t xml:space="preserve">31 Architecture Decision Records</w:t>
       </w:r>
       <w:r>
         <w:rPr>

</xml_diff>

<commit_message>
Harden the deliverable's upload feature against hostile input
Uploading a donor file (ADR 0029) meant every field the page renders or
exports could now come from a file nobody has reviewed, not only the
trusted, pipeline-built dataset. Found and fixed three real gaps: CSV
export had no formula-injection guard (added csvSafe, mirroring
donor_rules.csv_safe); donor_name, region, and stated_tier were written
into the table via unescaped innerHTML (added escapeHtml at every
insertion point, made pill() escape its own text); every localStorage call
was unguarded, and a browser with storage blocked would fail page
bootstrap entirely instead of degrading gracefully. Verified live with an
uploaded file containing an <img onerror> donor name: renders as inert
text, zero console errors. Also fixed a stale "June 30, 2024" reference in
docs/run-walkthrough.md left over from the prior letter-date fix. See ADR
0032.
</commit_message>
<xml_diff>
--- a/assessment/ASSESSMENT.docx
+++ b/assessment/ASSESSMENT.docx
@@ -101,7 +101,7 @@
           <w:sz w:val="22"/>
           <w:szCs w:val="22"/>
         </w:rPr>
-        <w:t xml:space="preserve">Run against the case study's own 50 donors: the pipeline catches four mislabeled tiers (one my own manual review of the table had missed), flags a reference-date trap, routes two lapsed major donors away from form letters, and generates 44 letters with a full audit trail. Nothing is ever sent automatically. 124 automated tests hold this behavior in place, re-run on every change by CI.</w:t>
+        <w:t xml:space="preserve">Run against the case study's own 50 donors: the pipeline catches four mislabeled tiers (one my own manual review of the table had missed), flags a reference-date trap, routes two lapsed major donors away from form letters, and generates 44 letters with a full audit trail. Nothing is ever sent automatically. 127 automated tests hold this behavior in place, re-run on every change by CI.</w:t>
       </w:r>
     </w:p>
     <w:p>
@@ -566,7 +566,7 @@
           <w:sz w:val="21"/>
           <w:szCs w:val="21"/>
         </w:rPr>
-        <w:t xml:space="preserve">31 Architecture Decision Records</w:t>
+        <w:t xml:space="preserve">32 Architecture Decision Records</w:t>
       </w:r>
       <w:r>
         <w:rPr>

</xml_diff>

<commit_message>
Rebuild ASSESSMENT.docx with the current test and ADR counts
Deferred from the prior commit since the file was open locally.
</commit_message>
<xml_diff>
--- a/assessment/ASSESSMENT.docx
+++ b/assessment/ASSESSMENT.docx
@@ -101,7 +101,7 @@
           <w:sz w:val="22"/>
           <w:szCs w:val="22"/>
         </w:rPr>
-        <w:t xml:space="preserve">Run against the case study's own 50 donors: the pipeline catches four mislabeled tiers (one my own manual review of the table had missed), flags a reference-date trap, routes two lapsed major donors away from form letters, and generates 44 letters with a full audit trail. Nothing is ever sent automatically. 127 automated tests hold this behavior in place, re-run on every change by CI.</w:t>
+        <w:t xml:space="preserve">Run against the case study's own 50 donors: the pipeline catches four mislabeled tiers (one my own manual review of the table had missed), flags a reference-date trap, routes two lapsed major donors away from form letters, and generates 44 letters with a full audit trail. Nothing is ever sent automatically. 134 automated tests hold this behavior in place, re-run on every change by CI.</w:t>
       </w:r>
     </w:p>
     <w:p>
@@ -566,7 +566,7 @@
           <w:sz w:val="21"/>
           <w:szCs w:val="21"/>
         </w:rPr>
-        <w:t xml:space="preserve">32 Architecture Decision Records</w:t>
+        <w:t xml:space="preserve">34 Architecture Decision Records</w:t>
       </w:r>
       <w:r>
         <w:rPr>

</xml_diff>

<commit_message>
Merge review app capabilities into the standalone deliverable
Ports the Streamlit review app's remaining portable capabilities into
donor-data-review.html so the file that actually travels to a reviewer
without a server has everything the app does: an architecture section
explaining what changed in SKILL.md and why a harness of deterministic
checks surrounds the model, a read-only campaign configuration panel,
a style-learning tool ported from learn_style.py and sanitize guardrails
(catching and fixing a real unknown-key bug in the port along the way),
and a donor-list merge feature that holds conflicting records for
side-by-side review instead of silently overwriting them. Adds a
session-local archive log alongside the existing dated-archive download.

Test suite grows from 140 to 154, all passing; corrected test and ADR
counts across the docs.
</commit_message>
<xml_diff>
--- a/assessment/ASSESSMENT.docx
+++ b/assessment/ASSESSMENT.docx
@@ -101,7 +101,7 @@
           <w:sz w:val="22"/>
           <w:szCs w:val="22"/>
         </w:rPr>
-        <w:t xml:space="preserve">Run against the case study's own 50 donors: the pipeline catches four mislabeled tiers (one my own manual review of the table had missed), flags a reference-date trap, routes two lapsed major donors away from form letters, and generates 44 letters with a full audit trail. Nothing is ever sent automatically. 140 automated tests hold this behavior in place, re-run on every change by CI.</w:t>
+        <w:t xml:space="preserve">Run against the case study's own 50 donors: the pipeline catches four mislabeled tiers (one my own manual review of the table had missed), flags a reference-date trap, routes two lapsed major donors away from form letters, and generates 44 letters with a full audit trail. Nothing is ever sent automatically. 154 automated tests hold this behavior in place, re-run on every change by CI.</w:t>
       </w:r>
     </w:p>
     <w:p>
@@ -566,7 +566,7 @@
           <w:sz w:val="21"/>
           <w:szCs w:val="21"/>
         </w:rPr>
-        <w:t xml:space="preserve">36 Architecture Decision Records</w:t>
+        <w:t xml:space="preserve">37 Architecture Decision Records</w:t>
       </w:r>
       <w:r>
         <w:rPr>

</xml_diff>